<commit_message>
docs: update HEMA phase-wise template documents
</commit_message>
<xml_diff>
--- a/HEMA Phase Wise Templets-/Brainstorming & Ideation Phase/Brainstorming- Idea Generation- Prioritizaation Template.docx
+++ b/HEMA Phase Wise Templets-/Brainstorming & Ideation Phase/Brainstorming- Idea Generation- Prioritizaation Template.docx
@@ -90,10 +90,7 @@
               <w:t>5</w:t>
             </w:r>
             <w:r>
-              <w:t xml:space="preserve"> </w:t>
-            </w:r>
-            <w:r>
-              <w:t>J</w:t>
+              <w:t xml:space="preserve"> J</w:t>
             </w:r>
             <w:r>
               <w:t>uly</w:t>
@@ -429,14 +426,7 @@
           <w:szCs w:val="24"/>
         </w:rPr>
         <w:lastRenderedPageBreak/>
-        <w:t>R</w:t>
-      </w:r>
-      <w:r>
-        <w:rPr>
-          <w:sz w:val="24"/>
-          <w:szCs w:val="24"/>
-        </w:rPr>
-        <w:t xml:space="preserve">eference: </w:t>
+        <w:t xml:space="preserve">Reference: </w:t>
       </w:r>
       <w:hyperlink r:id="rId5">
         <w:r>
@@ -458,34 +448,47 @@
       </w:pPr>
       <w:r>
         <w:rPr>
-          <w:b/>
-          <w:sz w:val="24"/>
-          <w:szCs w:val="24"/>
-        </w:rPr>
-        <w:t>Step-1: Team Gathering, Collaboration and Select the Problem Statement</w:t>
-      </w:r>
-    </w:p>
-    <w:p>
-      <w:r>
-        <w:rPr>
           <w:noProof/>
         </w:rPr>
         <w:drawing>
-          <wp:inline distT="0" distB="0" distL="0" distR="0" wp14:anchorId="73027A5E" wp14:editId="73027A5F">
-            <wp:extent cx="5731510" cy="4185285"/>
-            <wp:effectExtent l="0" t="0" r="0" b="0"/>
-            <wp:docPr id="6" name="image3.png" descr="Graphical user interface, application&#10;&#10;Description automatically generated"/>
-            <wp:cNvGraphicFramePr/>
+          <wp:anchor distT="0" distB="0" distL="114300" distR="114300" simplePos="0" relativeHeight="251658240" behindDoc="1" locked="0" layoutInCell="1" allowOverlap="1" wp14:anchorId="703834F9" wp14:editId="3EB13B14">
+            <wp:simplePos x="0" y="0"/>
+            <wp:positionH relativeFrom="margin">
+              <wp:align>right</wp:align>
+            </wp:positionH>
+            <wp:positionV relativeFrom="paragraph">
+              <wp:posOffset>528138</wp:posOffset>
+            </wp:positionV>
+            <wp:extent cx="5731510" cy="6656070"/>
+            <wp:effectExtent l="0" t="0" r="2540" b="0"/>
+            <wp:wrapTight wrapText="bothSides">
+              <wp:wrapPolygon edited="0">
+                <wp:start x="0" y="0"/>
+                <wp:lineTo x="0" y="21513"/>
+                <wp:lineTo x="21538" y="21513"/>
+                <wp:lineTo x="21538" y="0"/>
+                <wp:lineTo x="0" y="0"/>
+              </wp:wrapPolygon>
+            </wp:wrapTight>
+            <wp:docPr id="488440242" name="Picture 1"/>
+            <wp:cNvGraphicFramePr>
+              <a:graphicFrameLocks xmlns:a="http://schemas.openxmlformats.org/drawingml/2006/main" noChangeAspect="1"/>
+            </wp:cNvGraphicFramePr>
             <a:graphic xmlns:a="http://schemas.openxmlformats.org/drawingml/2006/main">
               <a:graphicData uri="http://schemas.openxmlformats.org/drawingml/2006/picture">
                 <pic:pic xmlns:pic="http://schemas.openxmlformats.org/drawingml/2006/picture">
                   <pic:nvPicPr>
-                    <pic:cNvPr id="0" name="image3.png" descr="Graphical user interface, application&#10;&#10;Description automatically generated"/>
-                    <pic:cNvPicPr preferRelativeResize="0"/>
+                    <pic:cNvPr id="488440242" name=""/>
+                    <pic:cNvPicPr/>
                   </pic:nvPicPr>
                   <pic:blipFill>
-                    <a:blip r:embed="rId6"/>
-                    <a:srcRect/>
+                    <a:blip r:embed="rId6">
+                      <a:extLst>
+                        <a:ext uri="{28A0092B-C50C-407E-A947-70E740481C1C}">
+                          <a14:useLocalDpi xmlns:a14="http://schemas.microsoft.com/office/drawing/2010/main" val="0"/>
+                        </a:ext>
+                      </a:extLst>
+                    </a:blip>
                     <a:stretch>
                       <a:fillRect/>
                     </a:stretch>
@@ -493,18 +496,33 @@
                   <pic:spPr>
                     <a:xfrm>
                       <a:off x="0" y="0"/>
-                      <a:ext cx="5731510" cy="4185285"/>
+                      <a:ext cx="5731510" cy="6656070"/>
                     </a:xfrm>
                     <a:prstGeom prst="rect">
                       <a:avLst/>
                     </a:prstGeom>
-                    <a:ln/>
                   </pic:spPr>
                 </pic:pic>
               </a:graphicData>
             </a:graphic>
-          </wp:inline>
+          </wp:anchor>
         </w:drawing>
+      </w:r>
+      <w:r>
+        <w:rPr>
+          <w:b/>
+          <w:sz w:val="24"/>
+          <w:szCs w:val="24"/>
+        </w:rPr>
+        <w:t>Step-1: Team Gathering, Collaboration and Select the Problem Statement</w:t>
+      </w:r>
+    </w:p>
+    <w:p>
+      <w:r>
+        <w:rPr>
+          <w:noProof/>
+        </w:rPr>
+        <w:t xml:space="preserve">  </w:t>
       </w:r>
     </w:p>
     <w:p/>
@@ -537,98 +555,50 @@
           <w:b/>
         </w:rPr>
       </w:pPr>
-    </w:p>
-    <w:p>
-      <w:pPr>
-        <w:rPr>
-          <w:b/>
-        </w:rPr>
-      </w:pPr>
-    </w:p>
-    <w:p>
-      <w:pPr>
-        <w:rPr>
-          <w:b/>
-        </w:rPr>
-      </w:pPr>
-    </w:p>
-    <w:p>
-      <w:pPr>
-        <w:rPr>
-          <w:b/>
-        </w:rPr>
-      </w:pPr>
-    </w:p>
-    <w:p>
-      <w:pPr>
-        <w:rPr>
-          <w:b/>
-        </w:rPr>
-      </w:pPr>
-    </w:p>
-    <w:p>
-      <w:pPr>
-        <w:rPr>
-          <w:b/>
-        </w:rPr>
-      </w:pPr>
-    </w:p>
-    <w:p>
-      <w:pPr>
-        <w:rPr>
-          <w:b/>
-        </w:rPr>
-      </w:pPr>
-    </w:p>
-    <w:p>
-      <w:pPr>
-        <w:rPr>
-          <w:b/>
-        </w:rPr>
-      </w:pPr>
-    </w:p>
-    <w:p>
-      <w:pPr>
-        <w:rPr>
-          <w:b/>
-        </w:rPr>
-      </w:pPr>
-    </w:p>
-    <w:p>
-      <w:pPr>
-        <w:rPr>
-          <w:b/>
-        </w:rPr>
-      </w:pPr>
-      <w:r>
-        <w:rPr>
-          <w:b/>
+      <w:r>
+        <w:rPr>
+          <w:noProof/>
         </w:rPr>
         <w:lastRenderedPageBreak/>
-        <w:t>Step-2: Brainstorm, Idea Listing and Grouping</w:t>
-      </w:r>
-    </w:p>
-    <w:p>
-      <w:r>
-        <w:rPr>
-          <w:noProof/>
-        </w:rPr>
         <w:drawing>
-          <wp:inline distT="0" distB="0" distL="0" distR="0" wp14:anchorId="73027A60" wp14:editId="73027A61">
-            <wp:extent cx="5731510" cy="3827780"/>
-            <wp:effectExtent l="0" t="0" r="0" b="0"/>
-            <wp:docPr id="8" name="image2.png" descr="Graphical user interface, treemap chart&#10;&#10;Description automatically generated"/>
-            <wp:cNvGraphicFramePr/>
+          <wp:anchor distT="0" distB="0" distL="114300" distR="114300" simplePos="0" relativeHeight="251659264" behindDoc="1" locked="0" layoutInCell="1" allowOverlap="1" wp14:anchorId="1E970423" wp14:editId="6AF8FBCA">
+            <wp:simplePos x="0" y="0"/>
+            <wp:positionH relativeFrom="margin">
+              <wp:align>right</wp:align>
+            </wp:positionH>
+            <wp:positionV relativeFrom="paragraph">
+              <wp:posOffset>204198</wp:posOffset>
+            </wp:positionV>
+            <wp:extent cx="5731510" cy="3719195"/>
+            <wp:effectExtent l="0" t="0" r="2540" b="0"/>
+            <wp:wrapTight wrapText="bothSides">
+              <wp:wrapPolygon edited="0">
+                <wp:start x="0" y="0"/>
+                <wp:lineTo x="0" y="21464"/>
+                <wp:lineTo x="21538" y="21464"/>
+                <wp:lineTo x="21538" y="0"/>
+                <wp:lineTo x="0" y="0"/>
+              </wp:wrapPolygon>
+            </wp:wrapTight>
+            <wp:docPr id="883682243" name="Picture 1"/>
+            <wp:cNvGraphicFramePr>
+              <a:graphicFrameLocks xmlns:a="http://schemas.openxmlformats.org/drawingml/2006/main" noChangeAspect="1"/>
+            </wp:cNvGraphicFramePr>
             <a:graphic xmlns:a="http://schemas.openxmlformats.org/drawingml/2006/main">
               <a:graphicData uri="http://schemas.openxmlformats.org/drawingml/2006/picture">
                 <pic:pic xmlns:pic="http://schemas.openxmlformats.org/drawingml/2006/picture">
                   <pic:nvPicPr>
-                    <pic:cNvPr id="0" name="image2.png" descr="Graphical user interface, treemap chart&#10;&#10;Description automatically generated"/>
-                    <pic:cNvPicPr preferRelativeResize="0"/>
+                    <pic:cNvPr id="883682243" name=""/>
+                    <pic:cNvPicPr/>
                   </pic:nvPicPr>
                   <pic:blipFill>
-                    <a:blip r:embed="rId7"/>
-                    <a:srcRect/>
+                    <a:blip r:embed="rId7">
+                      <a:extLst>
+                        <a:ext uri="{28A0092B-C50C-407E-A947-70E740481C1C}">
+                          <a14:useLocalDpi xmlns:a14="http://schemas.microsoft.com/office/drawing/2010/main" val="0"/>
+                        </a:ext>
+                      </a:extLst>
+                    </a:blip>
                     <a:stretch>
                       <a:fillRect/>
                     </a:stretch>
@@ -636,62 +606,61 @@
                   <pic:spPr>
                     <a:xfrm>
                       <a:off x="0" y="0"/>
-                      <a:ext cx="5731510" cy="3827780"/>
+                      <a:ext cx="5731510" cy="3719195"/>
                     </a:xfrm>
                     <a:prstGeom prst="rect">
                       <a:avLst/>
                     </a:prstGeom>
-                    <a:ln/>
                   </pic:spPr>
                 </pic:pic>
               </a:graphicData>
             </a:graphic>
-          </wp:inline>
+          </wp:anchor>
         </w:drawing>
       </w:r>
-    </w:p>
-    <w:p/>
-    <w:p>
-      <w:pPr>
-        <w:rPr>
-          <w:b/>
-        </w:rPr>
-      </w:pPr>
-      <w:r>
-        <w:rPr>
-          <w:b/>
-        </w:rPr>
-        <w:t>Step-3: Idea Prioritization</w:t>
-      </w:r>
-    </w:p>
-    <w:p>
-      <w:pPr>
-        <w:rPr>
-          <w:sz w:val="24"/>
-          <w:szCs w:val="24"/>
-        </w:rPr>
-      </w:pPr>
-      <w:r>
-        <w:rPr>
-          <w:b/>
+      <w:r>
+        <w:rPr>
+          <w:b/>
+        </w:rPr>
+        <w:t>Step-2: Brainstorm, Idea Listing and Grouping</w:t>
+      </w:r>
+    </w:p>
+    <w:p>
+      <w:r>
+        <w:rPr>
+          <w:b/>
+        </w:rPr>
+        <w:t xml:space="preserve">Step-3: Idea </w:t>
+      </w:r>
+      <w:proofErr w:type="spellStart"/>
+      <w:r>
+        <w:rPr>
+          <w:b/>
+        </w:rPr>
+        <w:t>Prioritiza</w:t>
+      </w:r>
+      <w:proofErr w:type="spellEnd"/>
+      <w:r>
+        <w:rPr>
           <w:noProof/>
         </w:rPr>
         <w:drawing>
-          <wp:inline distT="0" distB="0" distL="0" distR="0" wp14:anchorId="73027A62" wp14:editId="73027A63">
-            <wp:extent cx="3611587" cy="4323123"/>
-            <wp:effectExtent l="0" t="0" r="0" b="0"/>
-            <wp:docPr id="7" name="image1.png" descr="Diagram&#10;&#10;Description automatically generated"/>
-            <wp:cNvGraphicFramePr/>
+          <wp:inline distT="0" distB="0" distL="0" distR="0" wp14:anchorId="1683D646" wp14:editId="2B6B8DC9">
+            <wp:extent cx="5731510" cy="4674870"/>
+            <wp:effectExtent l="0" t="0" r="2540" b="0"/>
+            <wp:docPr id="98778715" name="Picture 1"/>
+            <wp:cNvGraphicFramePr>
+              <a:graphicFrameLocks xmlns:a="http://schemas.openxmlformats.org/drawingml/2006/main" noChangeAspect="1"/>
+            </wp:cNvGraphicFramePr>
             <a:graphic xmlns:a="http://schemas.openxmlformats.org/drawingml/2006/main">
               <a:graphicData uri="http://schemas.openxmlformats.org/drawingml/2006/picture">
                 <pic:pic xmlns:pic="http://schemas.openxmlformats.org/drawingml/2006/picture">
                   <pic:nvPicPr>
-                    <pic:cNvPr id="0" name="image1.png" descr="Diagram&#10;&#10;Description automatically generated"/>
-                    <pic:cNvPicPr preferRelativeResize="0"/>
+                    <pic:cNvPr id="98778715" name=""/>
+                    <pic:cNvPicPr/>
                   </pic:nvPicPr>
                   <pic:blipFill>
                     <a:blip r:embed="rId8"/>
-                    <a:srcRect/>
                     <a:stretch>
                       <a:fillRect/>
                     </a:stretch>
@@ -699,12 +668,11 @@
                   <pic:spPr>
                     <a:xfrm>
                       <a:off x="0" y="0"/>
-                      <a:ext cx="3611587" cy="4323123"/>
+                      <a:ext cx="5731510" cy="4674870"/>
                     </a:xfrm>
                     <a:prstGeom prst="rect">
                       <a:avLst/>
                     </a:prstGeom>
-                    <a:ln/>
                   </pic:spPr>
                 </pic:pic>
               </a:graphicData>
@@ -712,6 +680,22 @@
           </wp:inline>
         </w:drawing>
       </w:r>
+      <w:proofErr w:type="spellStart"/>
+      <w:r>
+        <w:rPr>
+          <w:b/>
+        </w:rPr>
+        <w:t>tion</w:t>
+      </w:r>
+      <w:proofErr w:type="spellEnd"/>
+    </w:p>
+    <w:p>
+      <w:pPr>
+        <w:rPr>
+          <w:sz w:val="24"/>
+          <w:szCs w:val="24"/>
+        </w:rPr>
+      </w:pPr>
     </w:p>
     <w:sectPr>
       <w:pgSz w:w="11906" w:h="16838"/>
@@ -1241,6 +1225,7 @@
   <w:style w:type="character" w:default="1" w:styleId="DefaultParagraphFont">
     <w:name w:val="Default Paragraph Font"/>
     <w:uiPriority w:val="1"/>
+    <w:semiHidden/>
     <w:unhideWhenUsed/>
   </w:style>
   <w:style w:type="table" w:default="1" w:styleId="TableNormal">
@@ -1691,8 +1676,8 @@
 <file path=customXml/itemProps1.xml><?xml version="1.0" encoding="utf-8"?>
 <ds:datastoreItem xmlns:ds="http://schemas.openxmlformats.org/officeDocument/2006/customXml" ds:itemID="{11111111-1234-1234-1234-123412341234}">
   <ds:schemaRefs>
+    <ds:schemaRef ds:uri="http://customooxmlschemas.google.com/"/>
     <ds:schemaRef ds:uri="http://schemas.openxmlformats.org/officeDocument/2006/relationships"/>
-    <ds:schemaRef ds:uri="http://customooxmlschemas.google.com/"/>
   </ds:schemaRefs>
 </ds:datastoreItem>
 </file>
</xml_diff>